<commit_message>
Add debugging-video script; rename Loom sheets
LOOM2-DEBUGGING covers the query-string bug end to end: the symptom, the Twilio
error that blamed the wrong component, testing that accusation before accepting
it, adding logging instead of guessing, the fix, and then fixing the harness
that should have caught it. Includes a way to reproduce the failure on camera in
20 seconds without placing a call.

Co-Authored-By: Claude Opus 5 (1M context) <noreply@anthropic.com>
</commit_message>
<xml_diff>
--- a/SUBMISSION.docx
+++ b/SUBMISSION.docx
@@ -429,6 +429,18 @@
       </w:r>
     </w:p>
     <w:p>
+      <w:r>
+        <w:t xml:space="preserve">Script: </w:t>
+      </w:r>
+      <w:r>
+        <w:rPr>
+          <w:color w:val="1A5FB4"/>
+          <w:u w:val="single"/>
+        </w:rPr>
+        <w:t>LOOM1-WALKTHROUGH.md</w:t>
+      </w:r>
+    </w:p>
+    <w:p>
       <w:pPr>
         <w:pStyle w:val="ListBullet"/>
       </w:pPr>
@@ -442,123 +454,27 @@
         <w:t>Loom video 2</w:t>
       </w:r>
       <w:r>
-        <w:t xml:space="preserve"> — you debugging with AI. Good material, in rough order of how</w:t>
+        <w:t xml:space="preserve"> — you prompting AI to debug and fix the code.</w:t>
       </w:r>
     </w:p>
     <w:p>
       <w:r>
-        <w:t>well it shows the loop:</w:t>
+        <w:t xml:space="preserve">Script: </w:t>
       </w:r>
-    </w:p>
-    <w:p>
-      <w:pPr>
-        <w:pStyle w:val="ListNumber"/>
-      </w:pPr>
       <w:r>
-        <w:t>The loopback harness went completely silent. The event log showed</w:t>
+        <w:rPr>
+          <w:color w:val="1A5FB4"/>
+          <w:u w:val="single"/>
+        </w:rPr>
+        <w:t>LOOM2-DEBUGGING.md</w:t>
+      </w:r>
+      <w:r>
+        <w:t>, which also explains how to</w:t>
       </w:r>
     </w:p>
     <w:p>
       <w:r>
-        <w:rPr>
-          <w:rFonts w:ascii="Menlo" w:hAnsi="Menlo"/>
-          <w:color w:val="333333"/>
-          <w:sz w:val="19"/>
-        </w:rPr>
-        <w:t>speech_started</w:t>
-      </w:r>
-      <w:r>
-        <w:t xml:space="preserve"> with no </w:t>
-      </w:r>
-      <w:r>
-        <w:rPr>
-          <w:rFonts w:ascii="Menlo" w:hAnsi="Menlo"/>
-          <w:color w:val="333333"/>
-          <w:sz w:val="19"/>
-        </w:rPr>
-        <w:t>speech_stopped</w:t>
-      </w:r>
-      <w:r>
-        <w:t xml:space="preserve"> — the relay sent nothing while</w:t>
-      </w:r>
-    </w:p>
-    <w:p>
-      <w:r>
-        <w:t>idle, but a real phone line carries silence frames and VAD needs to *hear*</w:t>
-      </w:r>
-    </w:p>
-    <w:p>
-      <w:r>
-        <w:t>the silence to close a turn.</w:t>
-      </w:r>
-    </w:p>
-    <w:p>
-      <w:pPr>
-        <w:pStyle w:val="ListNumber"/>
-      </w:pPr>
-      <w:r>
-        <w:t>First live call connected and was refused instantly. Twilio drops the query</w:t>
-      </w:r>
-    </w:p>
-    <w:p>
-      <w:r>
-        <w:t xml:space="preserve">string from </w:t>
-      </w:r>
-      <w:r>
-        <w:rPr>
-          <w:rFonts w:ascii="Menlo" w:hAnsi="Menlo"/>
-          <w:color w:val="333333"/>
-          <w:sz w:val="19"/>
-        </w:rPr>
-        <w:t>&lt;Stream url&gt;</w:t>
-      </w:r>
-      <w:r>
-        <w:t>, so the bridge never learned which scenario to</w:t>
-      </w:r>
-    </w:p>
-    <w:p>
-      <w:r>
-        <w:t xml:space="preserve">play. Fix: </w:t>
-      </w:r>
-      <w:r>
-        <w:rPr>
-          <w:rFonts w:ascii="Menlo" w:hAnsi="Menlo"/>
-          <w:color w:val="333333"/>
-          <w:sz w:val="19"/>
-        </w:rPr>
-        <w:t>&lt;Parameter&gt;</w:t>
-      </w:r>
-      <w:r>
-        <w:t xml:space="preserve"> children, read from the </w:t>
-      </w:r>
-      <w:r>
-        <w:rPr>
-          <w:rFonts w:ascii="Menlo" w:hAnsi="Menlo"/>
-          <w:color w:val="333333"/>
-          <w:sz w:val="19"/>
-        </w:rPr>
-        <w:t>start</w:t>
-      </w:r>
-      <w:r>
-        <w:t xml:space="preserve"> frame.</w:t>
-      </w:r>
-    </w:p>
-    <w:p>
-      <w:pPr>
-        <w:pStyle w:val="ListNumber"/>
-      </w:pPr>
-      <w:r>
-        <w:t>A transcript where the caller answers at 01:08 a question the agent asks at</w:t>
-      </w:r>
-    </w:p>
-    <w:p>
-      <w:r>
-        <w:t>01:09 — turns were stamped when the transcript resolved, not when the audio</w:t>
-      </w:r>
-    </w:p>
-    <w:p>
-      <w:r>
-        <w:t>was spoken.</w:t>
+        <w:t>reproduce the bug live on camera in 20 seconds without placing a call.</w:t>
       </w:r>
     </w:p>
     <w:p>

</xml_diff>

<commit_message>
Add a plain-English script for both Loom videos
Same content as the two timed beat sheets, rewritten with no jargon and no
timestamps: Twilio is the phone company, the bridge is a switchboard operator,
silence frames are the line "sending nothing" so the AI knows you stopped
talking. Both videos in one document, read top to bottom.

The timed sheets stay for anyone who wants to pace against a clock.

Co-Authored-By: Claude Opus 5 (1M context) <noreply@anthropic.com>
</commit_message>
<xml_diff>
--- a/SUBMISSION.docx
+++ b/SUBMISSION.docx
@@ -633,7 +633,29 @@
           <w:i w:val="0"/>
           <w:color w:val="1A5FB4"/>
         </w:rPr>
+        <w:t>LOOM-SCRIPTS-PLAIN.md</w:t>
+      </w:r>
+      <w:r>
+        <w:rPr>
+          <w:b w:val="0"/>
+          <w:i w:val="0"/>
+        </w:rPr>
+        <w:t xml:space="preserve"> (plain English, no timings) or </w:t>
+      </w:r>
+      <w:r>
+        <w:rPr>
+          <w:b w:val="0"/>
+          <w:i w:val="0"/>
+          <w:color w:val="1A5FB4"/>
+        </w:rPr>
         <w:t>LOOM1-WALKTHROUGH.md</w:t>
+      </w:r>
+      <w:r>
+        <w:rPr>
+          <w:b w:val="0"/>
+          <w:i w:val="0"/>
+        </w:rPr>
+        <w:t xml:space="preserve"> (timed beats)</w:t>
       </w:r>
     </w:p>
     <w:p>
@@ -667,6 +689,21 @@
           <w:i w:val="0"/>
           <w:color w:val="1A5FB4"/>
         </w:rPr>
+        <w:t>LOOM-SCRIPTS-PLAIN.md</w:t>
+      </w:r>
+      <w:r>
+        <w:rPr>
+          <w:b w:val="0"/>
+          <w:i w:val="0"/>
+        </w:rPr>
+        <w:t xml:space="preserve"> or </w:t>
+      </w:r>
+      <w:r>
+        <w:rPr>
+          <w:b w:val="0"/>
+          <w:i w:val="0"/>
+          <w:color w:val="1A5FB4"/>
+        </w:rPr>
         <w:t>LOOM2-DEBUGGING.md</w:t>
       </w:r>
       <w:r>
@@ -674,7 +711,7 @@
           <w:b w:val="0"/>
           <w:i w:val="0"/>
         </w:rPr>
-        <w:t>, which also explains how to reproduce the bug live on camera in 20 seconds without placing a call.</w:t>
+        <w:t>. Both explain how to reproduce the bug live on camera in 20 seconds without placing a call.</w:t>
       </w:r>
     </w:p>
     <w:p>

</xml_diff>